<commit_message>
modified:   Documentation/verisure-homey-documentation-v1_8_0.docx modified:   Documentation/verisure-homey-manuel-utilisateur-v1.8.0.docx modified:   README.md
</commit_message>
<xml_diff>
--- a/Documentation/verisure-homey-manuel-utilisateur-v1.8.0.docx
+++ b/Documentation/verisure-homey-manuel-utilisateur-v1.8.0.docx
@@ -503,7 +503,7 @@
                 <w:sz w:val="20"/>
                 <w:szCs w:val="20"/>
               </w:rPr>
-              <w:t xml:space="preserve">github.com/[votre-repo]</w:t>
+              <w:t xml:space="preserve">github.com/ediverchy/com.verisurefr</w:t>
             </w:r>
           </w:p>
         </w:tc>
@@ -4482,7 +4482,7 @@
                 <w:sz w:val="20"/>
                 <w:szCs w:val="20"/>
               </w:rPr>
-              <w:t xml:space="preserve">🔒 Amber</w:t>
+              <w:t xml:space="preserve">�� Amber</w:t>
             </w:r>
           </w:p>
         </w:tc>

</xml_diff>